<commit_message>
Zdolnik 3 practice, update specmath
</commit_message>
<xml_diff>
--- a/Специальные разделы математики/Практика/Практика №5.docx
+++ b/Специальные разделы математики/Практика/Практика №5.docx
@@ -307,7 +307,16 @@
           <w:szCs w:val="28"/>
           <w:lang w:eastAsia="en-US"/>
         </w:rPr>
-        <w:t>Отчет по практической работе № 4</w:t>
+        <w:t xml:space="preserve">Отчет по практической работе № </w:t>
+      </w:r>
+      <w:r>
+        <w:rPr>
+          <w:rFonts w:eastAsia="Calibri"/>
+          <w:color w:val="auto"/>
+          <w:szCs w:val="28"/>
+          <w:lang w:eastAsia="en-US"/>
+        </w:rPr>
+        <w:t>5</w:t>
       </w:r>
     </w:p>
     <w:p>
@@ -827,37 +836,46 @@
       <w:r>
         <w:t xml:space="preserve">2. </w:t>
       </w:r>
+      <w:proofErr w:type="spellStart"/>
       <w:r>
         <w:rPr>
           <w:i/>
           <w:iCs/>
         </w:rPr>
-        <w:t>Несмещенность оценки</w:t>
-      </w:r>
-      <w:r>
-        <w:t>: Среднее значение оценки равно истинному</w:t>
-      </w:r>
-    </w:p>
-    <w:p>
-      <w:pPr>
-        <w:spacing w:after="0" w:line="276" w:lineRule="auto"/>
-      </w:pPr>
-      <w:r>
-        <w:t>значению параметра.</w:t>
-      </w:r>
-    </w:p>
-    <w:p>
-      <w:pPr>
-        <w:spacing w:after="0" w:line="276" w:lineRule="auto"/>
-      </w:pPr>
-      <w:r>
-        <w:t xml:space="preserve">3. </w:t>
-      </w:r>
+        <w:t>Несмещенность</w:t>
+      </w:r>
+      <w:proofErr w:type="spellEnd"/>
       <w:r>
         <w:rPr>
           <w:i/>
           <w:iCs/>
         </w:rPr>
+        <w:t xml:space="preserve"> оценки</w:t>
+      </w:r>
+      <w:r>
+        <w:t>: Среднее значение оценки равно истинному</w:t>
+      </w:r>
+    </w:p>
+    <w:p>
+      <w:pPr>
+        <w:spacing w:after="0" w:line="276" w:lineRule="auto"/>
+      </w:pPr>
+      <w:r>
+        <w:t>значению параметра.</w:t>
+      </w:r>
+    </w:p>
+    <w:p>
+      <w:pPr>
+        <w:spacing w:after="0" w:line="276" w:lineRule="auto"/>
+      </w:pPr>
+      <w:r>
+        <w:t xml:space="preserve">3. </w:t>
+      </w:r>
+      <w:r>
+        <w:rPr>
+          <w:i/>
+          <w:iCs/>
+        </w:rPr>
         <w:t>Эффективность оценки</w:t>
       </w:r>
       <w:r>
@@ -913,6 +931,7 @@
       <w:r>
         <w:t xml:space="preserve">где </w:t>
       </w:r>
+      <w:proofErr w:type="gramStart"/>
       <w:r>
         <w:rPr>
           <w:rFonts w:ascii="Cambria Math" w:hAnsi="Cambria Math" w:cs="Cambria Math"/>
@@ -920,7 +939,11 @@
         <w:t>𝑥</w:t>
       </w:r>
       <w:r>
-        <w:t>!— элементы выборки, n — объем выборки.</w:t>
+        <w:t>!—</w:t>
+      </w:r>
+      <w:proofErr w:type="gramEnd"/>
+      <w:r>
+        <w:t xml:space="preserve"> элементы выборки, n — объем выборки.</w:t>
       </w:r>
     </w:p>
     <w:p>
@@ -1055,7 +1078,15 @@
         <w:spacing w:after="0" w:line="276" w:lineRule="auto"/>
       </w:pPr>
       <w:r>
-        <w:t>согласия (критерий Шапиро-Уилка).</w:t>
+        <w:t>согласия (критерий Шапиро-</w:t>
+      </w:r>
+      <w:proofErr w:type="spellStart"/>
+      <w:r>
+        <w:t>Уилка</w:t>
+      </w:r>
+      <w:proofErr w:type="spellEnd"/>
+      <w:r>
+        <w:t>).</w:t>
       </w:r>
     </w:p>
     <w:p>
@@ -1157,7 +1188,15 @@
         <w:t xml:space="preserve">Среднеквадратическое отклонение </w:t>
       </w:r>
       <w:r>
-        <w:t>(sigma(x)) — корень квадратный из</w:t>
+        <w:t>(</w:t>
+      </w:r>
+      <w:proofErr w:type="spellStart"/>
+      <w:r>
+        <w:t>sigma</w:t>
+      </w:r>
+      <w:proofErr w:type="spellEnd"/>
+      <w:r>
+        <w:t>(x)) — корень квадратный из</w:t>
       </w:r>
     </w:p>
     <w:p>
@@ -1198,32 +1237,48 @@
           <w:i/>
           <w:iCs/>
         </w:rPr>
-        <w:t xml:space="preserve">Критерий Шапиро-Уилка </w:t>
-      </w:r>
-      <w:r>
-        <w:t>— статистический тест для проверки гипотезы о</w:t>
-      </w:r>
-    </w:p>
-    <w:p>
-      <w:pPr>
-        <w:spacing w:after="0" w:line="276" w:lineRule="auto"/>
-      </w:pPr>
-      <w:r>
-        <w:t>нормальности распределения.</w:t>
-      </w:r>
-    </w:p>
-    <w:p>
-      <w:pPr>
-        <w:spacing w:after="0" w:line="276" w:lineRule="auto"/>
-      </w:pPr>
-      <w:r>
-        <w:t xml:space="preserve">6. </w:t>
-      </w:r>
+        <w:t>Критерий Шапиро-</w:t>
+      </w:r>
+      <w:proofErr w:type="spellStart"/>
       <w:r>
         <w:rPr>
           <w:i/>
           <w:iCs/>
         </w:rPr>
+        <w:t>Уилка</w:t>
+      </w:r>
+      <w:proofErr w:type="spellEnd"/>
+      <w:r>
+        <w:rPr>
+          <w:i/>
+          <w:iCs/>
+        </w:rPr>
+        <w:t xml:space="preserve"> </w:t>
+      </w:r>
+      <w:r>
+        <w:t>— статистический тест для проверки гипотезы о</w:t>
+      </w:r>
+    </w:p>
+    <w:p>
+      <w:pPr>
+        <w:spacing w:after="0" w:line="276" w:lineRule="auto"/>
+      </w:pPr>
+      <w:r>
+        <w:t>нормальности распределения.</w:t>
+      </w:r>
+    </w:p>
+    <w:p>
+      <w:pPr>
+        <w:spacing w:after="0" w:line="276" w:lineRule="auto"/>
+      </w:pPr>
+      <w:r>
+        <w:t xml:space="preserve">6. </w:t>
+      </w:r>
+      <w:r>
+        <w:rPr>
+          <w:i/>
+          <w:iCs/>
+        </w:rPr>
         <w:t xml:space="preserve">Доверительный интервал </w:t>
       </w:r>
       <w:r>
@@ -1291,6 +1346,9 @@
         <w:spacing w:after="0" w:line="276" w:lineRule="auto"/>
       </w:pPr>
       <w:r>
+        <w:rPr>
+          <w:noProof/>
+        </w:rPr>
         <w:drawing>
           <wp:inline distT="0" distB="0" distL="0" distR="0" wp14:anchorId="52D350C3" wp14:editId="55D33064">
             <wp:extent cx="6120765" cy="1814830"/>
@@ -1333,6 +1391,9 @@
         <w:spacing w:after="0" w:line="276" w:lineRule="auto"/>
       </w:pPr>
       <w:r>
+        <w:rPr>
+          <w:noProof/>
+        </w:rPr>
         <w:drawing>
           <wp:inline distT="0" distB="0" distL="0" distR="0" wp14:anchorId="5EE7FFAF" wp14:editId="0548CA0C">
             <wp:extent cx="3858163" cy="1038370"/>
@@ -1402,7 +1463,15 @@
         </w:rPr>
       </w:pPr>
       <w:r>
-        <w:t>Шапиро-Уилка).</w:t>
+        <w:t>Шапиро-</w:t>
+      </w:r>
+      <w:proofErr w:type="spellStart"/>
+      <w:r>
+        <w:t>Уилка</w:t>
+      </w:r>
+      <w:proofErr w:type="spellEnd"/>
+      <w:r>
+        <w:t>).</w:t>
       </w:r>
     </w:p>
     <w:p>
@@ -1414,6 +1483,7 @@
       </w:pPr>
       <w:r>
         <w:rPr>
+          <w:noProof/>
           <w:lang w:val="en-US"/>
         </w:rPr>
         <w:lastRenderedPageBreak/>
@@ -1463,6 +1533,7 @@
       </w:pPr>
       <w:r>
         <w:rPr>
+          <w:noProof/>
           <w:lang w:val="en-US"/>
         </w:rPr>
         <w:drawing>
@@ -1511,6 +1582,7 @@
       </w:pPr>
       <w:r>
         <w:rPr>
+          <w:noProof/>
           <w:lang w:val="en-US"/>
         </w:rPr>
         <w:drawing>
@@ -1594,6 +1666,7 @@
       </w:pPr>
       <w:r>
         <w:rPr>
+          <w:noProof/>
           <w:lang w:val="en-US"/>
         </w:rPr>
         <w:lastRenderedPageBreak/>
@@ -1646,10 +1719,10 @@
           <w:lang w:val="en-US"/>
         </w:rPr>
         <w:drawing>
-          <wp:inline distT="0" distB="0" distL="0" distR="0" wp14:anchorId="50FC88A6" wp14:editId="1DA59FE0">
-            <wp:extent cx="6120765" cy="309880"/>
+          <wp:inline distT="0" distB="0" distL="0" distR="0" wp14:anchorId="1AC63EB4" wp14:editId="3E6BCE04">
+            <wp:extent cx="6120765" cy="268605"/>
             <wp:effectExtent l="0" t="0" r="0" b="0"/>
-            <wp:docPr id="1640986784" name="Рисунок 1"/>
+            <wp:docPr id="1989375839" name="Рисунок 1"/>
             <wp:cNvGraphicFramePr>
               <a:graphicFrameLocks xmlns:a="http://schemas.openxmlformats.org/drawingml/2006/main" noChangeAspect="1"/>
             </wp:cNvGraphicFramePr>
@@ -1657,7 +1730,7 @@
               <a:graphicData uri="http://schemas.openxmlformats.org/drawingml/2006/picture">
                 <pic:pic xmlns:pic="http://schemas.openxmlformats.org/drawingml/2006/picture">
                   <pic:nvPicPr>
-                    <pic:cNvPr id="1640986784" name=""/>
+                    <pic:cNvPr id="1989375839" name=""/>
                     <pic:cNvPicPr/>
                   </pic:nvPicPr>
                   <pic:blipFill>
@@ -1669,7 +1742,7 @@
                   <pic:spPr>
                     <a:xfrm>
                       <a:off x="0" y="0"/>
-                      <a:ext cx="6120765" cy="309880"/>
+                      <a:ext cx="6120765" cy="268605"/>
                     </a:xfrm>
                     <a:prstGeom prst="rect">
                       <a:avLst/>
@@ -1709,30 +1782,27 @@
     <w:p>
       <w:pPr>
         <w:spacing w:after="0" w:line="276" w:lineRule="auto"/>
+      </w:pPr>
+      <w:r>
+        <w:t>Найдите корреляционный момент и коэффициент корреляции.</w:t>
+      </w:r>
+    </w:p>
+    <w:p>
+      <w:pPr>
+        <w:spacing w:after="0" w:line="276" w:lineRule="auto"/>
         <w:rPr>
           <w:lang w:val="en-US"/>
         </w:rPr>
       </w:pPr>
       <w:r>
-        <w:t>Найдите корреляционный момент и коэффициент корреляции.</w:t>
-      </w:r>
-    </w:p>
-    <w:p>
-      <w:pPr>
-        <w:spacing w:after="0" w:line="276" w:lineRule="auto"/>
         <w:rPr>
           <w:lang w:val="en-US"/>
         </w:rPr>
-      </w:pPr>
-      <w:r>
-        <w:rPr>
-          <w:lang w:val="en-US"/>
-        </w:rPr>
         <w:drawing>
-          <wp:inline distT="0" distB="0" distL="0" distR="0" wp14:anchorId="4ABA1735" wp14:editId="60192677">
-            <wp:extent cx="5658640" cy="3210373"/>
-            <wp:effectExtent l="0" t="0" r="0" b="9525"/>
-            <wp:docPr id="9362330" name="Рисунок 1"/>
+          <wp:inline distT="0" distB="0" distL="0" distR="0" wp14:anchorId="7D49AA0E" wp14:editId="63015BDD">
+            <wp:extent cx="6120765" cy="1977390"/>
+            <wp:effectExtent l="0" t="0" r="0" b="3810"/>
+            <wp:docPr id="9670430" name="Рисунок 1"/>
             <wp:cNvGraphicFramePr>
               <a:graphicFrameLocks xmlns:a="http://schemas.openxmlformats.org/drawingml/2006/main" noChangeAspect="1"/>
             </wp:cNvGraphicFramePr>
@@ -1740,7 +1810,7 @@
               <a:graphicData uri="http://schemas.openxmlformats.org/drawingml/2006/picture">
                 <pic:pic xmlns:pic="http://schemas.openxmlformats.org/drawingml/2006/picture">
                   <pic:nvPicPr>
-                    <pic:cNvPr id="9362330" name=""/>
+                    <pic:cNvPr id="9670430" name=""/>
                     <pic:cNvPicPr/>
                   </pic:nvPicPr>
                   <pic:blipFill>
@@ -1752,7 +1822,7 @@
                   <pic:spPr>
                     <a:xfrm>
                       <a:off x="0" y="0"/>
-                      <a:ext cx="5658640" cy="3210373"/>
+                      <a:ext cx="6120765" cy="1977390"/>
                     </a:xfrm>
                     <a:prstGeom prst="rect">
                       <a:avLst/>
@@ -1777,10 +1847,10 @@
           <w:lang w:val="en-US"/>
         </w:rPr>
         <w:drawing>
-          <wp:inline distT="0" distB="0" distL="0" distR="0" wp14:anchorId="305D6FB6" wp14:editId="0B937369">
-            <wp:extent cx="3886742" cy="514422"/>
+          <wp:inline distT="0" distB="0" distL="0" distR="0" wp14:anchorId="364E0298" wp14:editId="69C653F0">
+            <wp:extent cx="5287113" cy="514422"/>
             <wp:effectExtent l="0" t="0" r="0" b="0"/>
-            <wp:docPr id="1189986603" name="Рисунок 1"/>
+            <wp:docPr id="1368697668" name="Рисунок 1"/>
             <wp:cNvGraphicFramePr>
               <a:graphicFrameLocks xmlns:a="http://schemas.openxmlformats.org/drawingml/2006/main" noChangeAspect="1"/>
             </wp:cNvGraphicFramePr>
@@ -1788,7 +1858,7 @@
               <a:graphicData uri="http://schemas.openxmlformats.org/drawingml/2006/picture">
                 <pic:pic xmlns:pic="http://schemas.openxmlformats.org/drawingml/2006/picture">
                   <pic:nvPicPr>
-                    <pic:cNvPr id="1189986603" name=""/>
+                    <pic:cNvPr id="1368697668" name=""/>
                     <pic:cNvPicPr/>
                   </pic:nvPicPr>
                   <pic:blipFill>
@@ -1800,7 +1870,7 @@
                   <pic:spPr>
                     <a:xfrm>
                       <a:off x="0" y="0"/>
-                      <a:ext cx="3886742" cy="514422"/>
+                      <a:ext cx="5287113" cy="514422"/>
                     </a:xfrm>
                     <a:prstGeom prst="rect">
                       <a:avLst/>
@@ -1845,7 +1915,15 @@
         </w:rPr>
       </w:pPr>
       <w:r>
-        <w:t>ожидания с погрешностью 0.5 и доверительной вероятностью 95%.__</w:t>
+        <w:t>ожидания с погрешностью 0.5 и доверительной вероятностью 95</w:t>
+      </w:r>
+      <w:proofErr w:type="gramStart"/>
+      <w:r>
+        <w:t>%._</w:t>
+      </w:r>
+      <w:proofErr w:type="gramEnd"/>
+      <w:r>
+        <w:t>_</w:t>
       </w:r>
     </w:p>
     <w:p>
@@ -1857,6 +1935,7 @@
       </w:pPr>
       <w:r>
         <w:rPr>
+          <w:noProof/>
           <w:lang w:val="en-US"/>
         </w:rPr>
         <w:lastRenderedPageBreak/>
@@ -1906,6 +1985,7 @@
       </w:pPr>
       <w:r>
         <w:rPr>
+          <w:noProof/>
           <w:lang w:val="en-US"/>
         </w:rPr>
         <w:drawing>
@@ -3183,6 +3263,7 @@
   <w:style w:type="character" w:default="1" w:styleId="a0">
     <w:name w:val="Default Paragraph Font"/>
     <w:uiPriority w:val="1"/>
+    <w:semiHidden/>
     <w:unhideWhenUsed/>
   </w:style>
   <w:style w:type="table" w:default="1" w:styleId="a1">

</xml_diff>